<commit_message>
finsihed all updates for R2
</commit_message>
<xml_diff>
--- a/Outputs/Table4.docx
+++ b/Outputs/Table4.docx
@@ -5441,169 +5441,169 @@
                 <w:szCs w:val="18"/>
                 <w:color w:val="000000"/>
               </w:rPr>
-              <w:t xml:space="preserve">53.1 ± 32.4</w:t>
-            </w:r>
-          </w:p>
-        </w:tc>
-        <w:tc>
-          <w:tcPr>
-            <w:tcBorders>
-              <w:bottom w:val="none" w:sz="0" w:space="0" w:color="000000"/>
-              <w:top w:val="none" w:sz="0" w:space="0" w:color="000000"/>
-              <w:left w:val="none" w:sz="0" w:space="0" w:color="000000"/>
-              <w:right w:val="none" w:sz="0" w:space="0" w:color="000000"/>
-            </w:tcBorders>
-            <w:shd w:val="clear" w:color="auto" w:fill="FFFFFF"/>
-            <w:tcMar>
-              <w:top w:w="0" w:type="dxa"/>
-              <w:bottom w:w="0" w:type="dxa"/>
-              <w:left w:w="0" w:type="dxa"/>
-              <w:right w:w="0" w:type="dxa"/>
-            </w:tcMar>
-            <w:vAlign w:val="center"/>
-          </w:tcPr>
-          <w:p>
-            <w:pPr>
-              <w:jc w:val="center"/>
-              <w:pBdr>
-                <w:bottom w:val="none" w:sz="0" w:space="0" w:color="000000"/>
-                <w:top w:val="none" w:sz="0" w:space="0" w:color="000000"/>
-                <w:left w:val="none" w:sz="0" w:space="0" w:color="000000"/>
-                <w:right w:val="none" w:sz="0" w:space="0" w:color="000000"/>
-              </w:pBdr>
-              <w:spacing w:after="0" w:before="0" w:line="240"/>
-              <w:ind w:left="0" w:right="120" w:firstLine="0" w:firstLineChars="0"/>
-              <w:rPr>
-                <w:rFonts w:ascii="Arial" w:hAnsi="Arial" w:eastAsia="Arial" w:cs="Arial"/>
-                <w:i w:val="false"/>
-                <w:b w:val="false"/>
-                <w:u w:val="none"/>
-                <w:strike w:val="false"/>
-                <w:sz w:val="18"/>
-                <w:szCs w:val="18"/>
-                <w:color w:val="000000"/>
-              </w:rPr>
-            </w:pPr>
-            <w:r>
-              <w:rPr>
-                <w:rFonts w:ascii="Arial" w:hAnsi="Arial" w:eastAsia="Arial" w:cs="Arial"/>
-                <w:i w:val="false"/>
-                <w:b w:val="false"/>
-                <w:u w:val="none"/>
-                <w:strike w:val="false"/>
-                <w:sz w:val="18"/>
-                <w:szCs w:val="18"/>
-                <w:color w:val="000000"/>
-              </w:rPr>
-              <w:t xml:space="preserve">69.6 ± 49.2</w:t>
-            </w:r>
-          </w:p>
-        </w:tc>
-        <w:tc>
-          <w:tcPr>
-            <w:tcBorders>
-              <w:bottom w:val="none" w:sz="0" w:space="0" w:color="000000"/>
-              <w:top w:val="none" w:sz="0" w:space="0" w:color="000000"/>
-              <w:left w:val="none" w:sz="0" w:space="0" w:color="000000"/>
-              <w:right w:val="none" w:sz="0" w:space="0" w:color="000000"/>
-            </w:tcBorders>
-            <w:shd w:val="clear" w:color="auto" w:fill="FFFFFF"/>
-            <w:tcMar>
-              <w:top w:w="0" w:type="dxa"/>
-              <w:bottom w:w="0" w:type="dxa"/>
-              <w:left w:w="0" w:type="dxa"/>
-              <w:right w:w="0" w:type="dxa"/>
-            </w:tcMar>
-            <w:vAlign w:val="center"/>
-          </w:tcPr>
-          <w:p>
-            <w:pPr>
-              <w:jc w:val="center"/>
-              <w:pBdr>
-                <w:bottom w:val="none" w:sz="0" w:space="0" w:color="000000"/>
-                <w:top w:val="none" w:sz="0" w:space="0" w:color="000000"/>
-                <w:left w:val="none" w:sz="0" w:space="0" w:color="000000"/>
-                <w:right w:val="none" w:sz="0" w:space="0" w:color="000000"/>
-              </w:pBdr>
-              <w:spacing w:after="0" w:before="0" w:line="240"/>
-              <w:ind w:left="0" w:right="120" w:firstLine="0" w:firstLineChars="0"/>
-              <w:rPr>
-                <w:rFonts w:ascii="Arial" w:hAnsi="Arial" w:eastAsia="Arial" w:cs="Arial"/>
-                <w:i w:val="false"/>
-                <w:b w:val="false"/>
-                <w:u w:val="none"/>
-                <w:strike w:val="false"/>
-                <w:sz w:val="18"/>
-                <w:szCs w:val="18"/>
-                <w:color w:val="000000"/>
-              </w:rPr>
-            </w:pPr>
-            <w:r>
-              <w:rPr>
-                <w:rFonts w:ascii="Arial" w:hAnsi="Arial" w:eastAsia="Arial" w:cs="Arial"/>
-                <w:i w:val="false"/>
-                <w:b w:val="false"/>
-                <w:u w:val="none"/>
-                <w:strike w:val="false"/>
-                <w:sz w:val="18"/>
-                <w:szCs w:val="18"/>
-                <w:color w:val="000000"/>
-              </w:rPr>
-              <w:t xml:space="preserve">56.7 ± 36.8</w:t>
-            </w:r>
-          </w:p>
-        </w:tc>
-        <w:tc>
-          <w:tcPr>
-            <w:tcBorders>
-              <w:bottom w:val="none" w:sz="0" w:space="0" w:color="000000"/>
-              <w:top w:val="none" w:sz="0" w:space="0" w:color="000000"/>
-              <w:left w:val="none" w:sz="0" w:space="0" w:color="000000"/>
-              <w:right w:val="none" w:sz="0" w:space="0" w:color="000000"/>
-            </w:tcBorders>
-            <w:shd w:val="clear" w:color="auto" w:fill="FFFFFF"/>
-            <w:tcMar>
-              <w:top w:w="0" w:type="dxa"/>
-              <w:bottom w:w="0" w:type="dxa"/>
-              <w:left w:w="0" w:type="dxa"/>
-              <w:right w:w="0" w:type="dxa"/>
-            </w:tcMar>
-            <w:vAlign w:val="center"/>
-          </w:tcPr>
-          <w:p>
-            <w:pPr>
-              <w:jc w:val="center"/>
-              <w:pBdr>
-                <w:bottom w:val="none" w:sz="0" w:space="0" w:color="000000"/>
-                <w:top w:val="none" w:sz="0" w:space="0" w:color="000000"/>
-                <w:left w:val="none" w:sz="0" w:space="0" w:color="000000"/>
-                <w:right w:val="none" w:sz="0" w:space="0" w:color="000000"/>
-              </w:pBdr>
-              <w:spacing w:after="0" w:before="0" w:line="240"/>
-              <w:ind w:left="0" w:right="120" w:firstLine="0" w:firstLineChars="0"/>
-              <w:rPr>
-                <w:rFonts w:ascii="Arial" w:hAnsi="Arial" w:eastAsia="Arial" w:cs="Arial"/>
-                <w:i w:val="false"/>
-                <w:b w:val="false"/>
-                <w:u w:val="none"/>
-                <w:strike w:val="false"/>
-                <w:sz w:val="18"/>
-                <w:szCs w:val="18"/>
-                <w:color w:val="000000"/>
-              </w:rPr>
-            </w:pPr>
-            <w:r>
-              <w:rPr>
-                <w:rFonts w:ascii="Arial" w:hAnsi="Arial" w:eastAsia="Arial" w:cs="Arial"/>
-                <w:i w:val="false"/>
-                <w:b w:val="false"/>
-                <w:u w:val="none"/>
-                <w:strike w:val="false"/>
-                <w:sz w:val="18"/>
-                <w:szCs w:val="18"/>
-                <w:color w:val="000000"/>
-              </w:rPr>
-              <w:t xml:space="preserve">0.25</w:t>
+              <w:t xml:space="preserve">48.9 [32.8–69.3]</w:t>
+            </w:r>
+          </w:p>
+        </w:tc>
+        <w:tc>
+          <w:tcPr>
+            <w:tcBorders>
+              <w:bottom w:val="none" w:sz="0" w:space="0" w:color="000000"/>
+              <w:top w:val="none" w:sz="0" w:space="0" w:color="000000"/>
+              <w:left w:val="none" w:sz="0" w:space="0" w:color="000000"/>
+              <w:right w:val="none" w:sz="0" w:space="0" w:color="000000"/>
+            </w:tcBorders>
+            <w:shd w:val="clear" w:color="auto" w:fill="FFFFFF"/>
+            <w:tcMar>
+              <w:top w:w="0" w:type="dxa"/>
+              <w:bottom w:w="0" w:type="dxa"/>
+              <w:left w:w="0" w:type="dxa"/>
+              <w:right w:w="0" w:type="dxa"/>
+            </w:tcMar>
+            <w:vAlign w:val="center"/>
+          </w:tcPr>
+          <w:p>
+            <w:pPr>
+              <w:jc w:val="center"/>
+              <w:pBdr>
+                <w:bottom w:val="none" w:sz="0" w:space="0" w:color="000000"/>
+                <w:top w:val="none" w:sz="0" w:space="0" w:color="000000"/>
+                <w:left w:val="none" w:sz="0" w:space="0" w:color="000000"/>
+                <w:right w:val="none" w:sz="0" w:space="0" w:color="000000"/>
+              </w:pBdr>
+              <w:spacing w:after="0" w:before="0" w:line="240"/>
+              <w:ind w:left="0" w:right="120" w:firstLine="0" w:firstLineChars="0"/>
+              <w:rPr>
+                <w:rFonts w:ascii="Arial" w:hAnsi="Arial" w:eastAsia="Arial" w:cs="Arial"/>
+                <w:i w:val="false"/>
+                <w:b w:val="false"/>
+                <w:u w:val="none"/>
+                <w:strike w:val="false"/>
+                <w:sz w:val="18"/>
+                <w:szCs w:val="18"/>
+                <w:color w:val="000000"/>
+              </w:rPr>
+            </w:pPr>
+            <w:r>
+              <w:rPr>
+                <w:rFonts w:ascii="Arial" w:hAnsi="Arial" w:eastAsia="Arial" w:cs="Arial"/>
+                <w:i w:val="false"/>
+                <w:b w:val="false"/>
+                <w:u w:val="none"/>
+                <w:strike w:val="false"/>
+                <w:sz w:val="18"/>
+                <w:szCs w:val="18"/>
+                <w:color w:val="000000"/>
+              </w:rPr>
+              <w:t xml:space="preserve">62.8 [39.4–70]</w:t>
+            </w:r>
+          </w:p>
+        </w:tc>
+        <w:tc>
+          <w:tcPr>
+            <w:tcBorders>
+              <w:bottom w:val="none" w:sz="0" w:space="0" w:color="000000"/>
+              <w:top w:val="none" w:sz="0" w:space="0" w:color="000000"/>
+              <w:left w:val="none" w:sz="0" w:space="0" w:color="000000"/>
+              <w:right w:val="none" w:sz="0" w:space="0" w:color="000000"/>
+            </w:tcBorders>
+            <w:shd w:val="clear" w:color="auto" w:fill="FFFFFF"/>
+            <w:tcMar>
+              <w:top w:w="0" w:type="dxa"/>
+              <w:bottom w:w="0" w:type="dxa"/>
+              <w:left w:w="0" w:type="dxa"/>
+              <w:right w:w="0" w:type="dxa"/>
+            </w:tcMar>
+            <w:vAlign w:val="center"/>
+          </w:tcPr>
+          <w:p>
+            <w:pPr>
+              <w:jc w:val="center"/>
+              <w:pBdr>
+                <w:bottom w:val="none" w:sz="0" w:space="0" w:color="000000"/>
+                <w:top w:val="none" w:sz="0" w:space="0" w:color="000000"/>
+                <w:left w:val="none" w:sz="0" w:space="0" w:color="000000"/>
+                <w:right w:val="none" w:sz="0" w:space="0" w:color="000000"/>
+              </w:pBdr>
+              <w:spacing w:after="0" w:before="0" w:line="240"/>
+              <w:ind w:left="0" w:right="120" w:firstLine="0" w:firstLineChars="0"/>
+              <w:rPr>
+                <w:rFonts w:ascii="Arial" w:hAnsi="Arial" w:eastAsia="Arial" w:cs="Arial"/>
+                <w:i w:val="false"/>
+                <w:b w:val="false"/>
+                <w:u w:val="none"/>
+                <w:strike w:val="false"/>
+                <w:sz w:val="18"/>
+                <w:szCs w:val="18"/>
+                <w:color w:val="000000"/>
+              </w:rPr>
+            </w:pPr>
+            <w:r>
+              <w:rPr>
+                <w:rFonts w:ascii="Arial" w:hAnsi="Arial" w:eastAsia="Arial" w:cs="Arial"/>
+                <w:i w:val="false"/>
+                <w:b w:val="false"/>
+                <w:u w:val="none"/>
+                <w:strike w:val="false"/>
+                <w:sz w:val="18"/>
+                <w:szCs w:val="18"/>
+                <w:color w:val="000000"/>
+              </w:rPr>
+              <w:t xml:space="preserve">55.3 [33.2–69.3]</w:t>
+            </w:r>
+          </w:p>
+        </w:tc>
+        <w:tc>
+          <w:tcPr>
+            <w:tcBorders>
+              <w:bottom w:val="none" w:sz="0" w:space="0" w:color="000000"/>
+              <w:top w:val="none" w:sz="0" w:space="0" w:color="000000"/>
+              <w:left w:val="none" w:sz="0" w:space="0" w:color="000000"/>
+              <w:right w:val="none" w:sz="0" w:space="0" w:color="000000"/>
+            </w:tcBorders>
+            <w:shd w:val="clear" w:color="auto" w:fill="FFFFFF"/>
+            <w:tcMar>
+              <w:top w:w="0" w:type="dxa"/>
+              <w:bottom w:w="0" w:type="dxa"/>
+              <w:left w:w="0" w:type="dxa"/>
+              <w:right w:w="0" w:type="dxa"/>
+            </w:tcMar>
+            <w:vAlign w:val="center"/>
+          </w:tcPr>
+          <w:p>
+            <w:pPr>
+              <w:jc w:val="center"/>
+              <w:pBdr>
+                <w:bottom w:val="none" w:sz="0" w:space="0" w:color="000000"/>
+                <w:top w:val="none" w:sz="0" w:space="0" w:color="000000"/>
+                <w:left w:val="none" w:sz="0" w:space="0" w:color="000000"/>
+                <w:right w:val="none" w:sz="0" w:space="0" w:color="000000"/>
+              </w:pBdr>
+              <w:spacing w:after="0" w:before="0" w:line="240"/>
+              <w:ind w:left="0" w:right="120" w:firstLine="0" w:firstLineChars="0"/>
+              <w:rPr>
+                <w:rFonts w:ascii="Arial" w:hAnsi="Arial" w:eastAsia="Arial" w:cs="Arial"/>
+                <w:i w:val="false"/>
+                <w:b w:val="false"/>
+                <w:u w:val="none"/>
+                <w:strike w:val="false"/>
+                <w:sz w:val="18"/>
+                <w:szCs w:val="18"/>
+                <w:color w:val="000000"/>
+              </w:rPr>
+            </w:pPr>
+            <w:r>
+              <w:rPr>
+                <w:rFonts w:ascii="Arial" w:hAnsi="Arial" w:eastAsia="Arial" w:cs="Arial"/>
+                <w:i w:val="false"/>
+                <w:b w:val="false"/>
+                <w:u w:val="none"/>
+                <w:strike w:val="false"/>
+                <w:sz w:val="18"/>
+                <w:szCs w:val="18"/>
+                <w:color w:val="000000"/>
+              </w:rPr>
+              <w:t xml:space="preserve">0.23</w:t>
             </w:r>
           </w:p>
         </w:tc>

</xml_diff>

<commit_message>
made fishers 2x2 be a function multiplying smallest one-tailed p value for fig 3 , sup table 1, table 4 per reviewer request.
</commit_message>
<xml_diff>
--- a/Outputs/Table4.docx
+++ b/Outputs/Table4.docx
@@ -6491,7 +6491,7 @@
                 <w:szCs w:val="18"/>
                 <w:color w:val="000000"/>
               </w:rPr>
-              <w:t xml:space="preserve">readmission_wi_30d: Y</w:t>
+              <w:t xml:space="preserve">readmission_wi_30d</w:t>
             </w:r>
           </w:p>
         </w:tc>
@@ -6768,72 +6768,7 @@
                 <w:szCs w:val="12"/>
                 <w:color w:val="000000"/>
               </w:rPr>
-              <w:t xml:space="preserve">Statistical Methods: For continuous variables, normality was assessed using the Shapiro–Wilk test (when enabled). Normally distributed variables were summarized as mean ± SD and compared using Welch's t-test for two-group comparisons or one-way ANOVA for three-group comparisons. Non-normally distributed or user-specified ordinal variables were summarized as median [IQR] and compared using the Wilcoxon rank-sum test (two groups) or Kruskal–Wallis test (three groups). Categorical variables were summarized as n (%) and compared using Chi-squared tests or Fisher's exact tests when expected counts were &lt;5. For binary categorical variables, odds ratios with 95% confidence intervals were computed using Fisher's exact or Wald methods, as appropriate. Approximate p-values were used for non-parametric tests with tied data.</w:t>
-            </w:r>
-            <w:r>
-              <w:rPr>
-                <w:rFonts w:ascii="Arial" w:hAnsi="Arial" w:eastAsia="Arial" w:cs="Arial"/>
-                <w:i w:val="true"/>
-                <w:b w:val="false"/>
-                <w:u w:val="none"/>
-                <w:strike w:val="false"/>
-                <w:sz w:val="12"/>
-                <w:szCs w:val="12"/>
-                <w:color w:val="000000"/>
-              </w:rPr>
-              <w:br/>
-            </w:r>
-            <w:r>
-              <w:rPr>
-                <w:rFonts w:ascii="Arial" w:hAnsi="Arial" w:eastAsia="Arial" w:cs="Arial"/>
-                <w:i w:val="true"/>
-                <w:b w:val="false"/>
-                <w:u w:val="none"/>
-                <w:strike w:val="false"/>
-                <w:sz w:val="12"/>
-                <w:szCs w:val="12"/>
-                <w:color w:val="000000"/>
-              </w:rPr>
-              <w:br/>
-            </w:r>
-            <w:r>
-              <w:rPr>
-                <w:rFonts w:ascii="Arial" w:hAnsi="Arial" w:eastAsia="Arial" w:cs="Arial"/>
-                <w:i w:val="true"/>
-                <w:b w:val="false"/>
-                <w:u w:val="none"/>
-                <w:strike w:val="false"/>
-                <w:sz w:val="12"/>
-                <w:szCs w:val="12"/>
-                <w:color w:val="000000"/>
-              </w:rPr>
-              <w:t xml:space="preserve">*- All values are presented as mean ± SD for normally distributed continuous variables, median [IQR] for non-normally distributed continuous or ordinal variables, and n (%) for categorical variables.</w:t>
-            </w:r>
-            <w:r>
-              <w:rPr>
-                <w:rFonts w:ascii="Arial" w:hAnsi="Arial" w:eastAsia="Arial" w:cs="Arial"/>
-                <w:i w:val="true"/>
-                <w:b w:val="false"/>
-                <w:u w:val="none"/>
-                <w:strike w:val="false"/>
-                <w:sz w:val="12"/>
-                <w:szCs w:val="12"/>
-                <w:color w:val="000000"/>
-              </w:rPr>
-              <w:br/>
-            </w:r>
-            <w:r>
-              <w:rPr>
-                <w:rFonts w:ascii="Arial" w:hAnsi="Arial" w:eastAsia="Arial" w:cs="Arial"/>
-                <w:i w:val="true"/>
-                <w:b w:val="false"/>
-                <w:u w:val="none"/>
-                <w:strike w:val="false"/>
-                <w:sz w:val="12"/>
-                <w:szCs w:val="12"/>
-                <w:color w:val="000000"/>
-              </w:rPr>
-              <w:t xml:space="preserve">†- Welch's t-test was used to compute p-values for normally distributed continuous variables. Wilcoxon Rank Sum test was used to compute p-values for non-normally distributed continuous or ordinal variables. Fisher's exact or chi-squared test was used to compute p-values for categorical variables, as appropriate. p-values are bolded for p ≤ 0.05.</w:t>
+              <w:t xml:space="preserve">†- Continuous variables are presented as mean ± SD for normally distributed variables or median [IQR] for non-normally distributed or ordinal variables. Categorical variables are presented as n (%).</w:t>
             </w:r>
           </w:p>
         </w:tc>

</xml_diff>